<commit_message>
fix(docx): byte-reproducible Word document inside every integrity check; no sample residue
Delivery review of cb23eb7, items 1 and 5 (AUD-F35, AUD-F36):
- build_docx normalizes the zip container (fixed timestamps/attrs/level) and stamps dataset-derived core properties
- docx fingerprinted in the release manifest (ships in the bundle), hashed by both reproducibility gates, diffed without exclusion in CI, buildspec and the Actions loop
- build_inactive_classes.py step of sdr.py build regenerates every inactive class (JSON, text, Word); CI per-class loop removed
- both sample builders restore the validation reports; end-to-end test proves the Class C sample leaves the tree byte-identical (was 409 fictional occurrences)
- all three committed docx regenerated deterministically
</commit_message>
<xml_diff>
--- a/sdr/human-readable/sdr-class-a-authoring.docx
+++ b/sdr/human-readable/sdr-class-a-authoring.docx
@@ -7008,7 +7008,7 @@
         <w:rPr>
           <w:i w:val="0"/>
         </w:rPr>
-        <w:t>Example test 1: describe-trails confirms multi-region and log file validation are enabled and the trail is logging (every 6 hours).; Example test 2: Config aggregator query confirms recorder status is recording in 100 percent of in-scope accounts (daily).</w:t>
+        <w:t>Example (reference architecture, replace with your real implementation): AWS Config managed rule multi-region-cloudtrail-enabled confirms an organization trail records management events in every region; pass requires COMPLIANT in every in-scope account. (automated, continuous (AWS Config evaluation), collected daily); Example (reference architecture, replace with your real implementation): AWS Config managed rule cloud-trail-log-file-validation-enabled confirms trail log-file integrity validation is on; pass requires COMPLIANT for every trail. (automated, continuous (AWS Config evaluation), collected daily)</w:t>
       </w:r>
     </w:p>
     <w:p>
@@ -7626,7 +7626,7 @@
         <w:rPr>
           <w:i w:val="0"/>
         </w:rPr>
-        <w:t>Example test 1: config rule iam-user-no-passwords-or-keys returns COMPLIANT for all accounts (daily).; Example test 2: CloudTrail Lake query for console login events without MFA returns zero rows (daily).</w:t>
+        <w:t>Example (reference architecture, replace with your real implementation): AWS Config managed rule mfa-enabled-for-iam-console-access confirms no console password exists without MFA; pass requires COMPLIANT in every in-scope account. (automated, continuous (AWS Config evaluation), collected daily); Example (reference architecture, replace with your real implementation): AWS Config managed rule root-account-mfa-enabled confirms the root user is MFA-protected; pass requires COMPLIANT in every in-scope account. (automated, continuous (AWS Config evaluation), collected daily)</w:t>
       </w:r>
     </w:p>
     <w:p>
@@ -8038,7 +8038,7 @@
         <w:rPr>
           <w:i w:val="0"/>
         </w:rPr>
-        <w:t>Example test 1: Config rules encrypted-volumes and rds-storage-encrypted are COMPLIANT for all resources (continuous).; Example test 2: EBS default encryption and S3 Block Public Access report enabled for every in-scope account (daily).</w:t>
+        <w:t>Example (reference architecture, replace with your real implementation): AWS Config managed rule encrypted-volumes confirms every attached EBS volume is encrypted; pass requires COMPLIANT for all resources. (automated, continuous (AWS Config evaluation), collected daily); Example (reference architecture, replace with your real implementation): AWS Config managed rule s3-bucket-server-side-encryption-enabled confirms default encryption on every bucket; pass requires COMPLIANT for all buckets. (automated, continuous (AWS Config evaluation), collected daily)</w:t>
       </w:r>
     </w:p>
     <w:p>

</xml_diff>

<commit_message>
fix(docx): byte-reproducible Word document inside every integrity check; no sample residue (#193)
Delivery review of cb23eb7, items 1 and 5 (AUD-F35, AUD-F36):
- build_docx normalizes the zip container (fixed timestamps/attrs/level) and stamps dataset-derived core properties
- docx fingerprinted in the release manifest (ships in the bundle), hashed by both reproducibility gates, diffed without exclusion in CI, buildspec and the Actions loop
- build_inactive_classes.py step of sdr.py build regenerates every inactive class (JSON, text, Word); CI per-class loop removed
- both sample builders restore the validation reports; end-to-end test proves the Class C sample leaves the tree byte-identical (was 409 fictional occurrences)
- all three committed docx regenerated deterministically
</commit_message>
<xml_diff>
--- a/sdr/human-readable/sdr-class-a-authoring.docx
+++ b/sdr/human-readable/sdr-class-a-authoring.docx
@@ -7008,7 +7008,7 @@
         <w:rPr>
           <w:i w:val="0"/>
         </w:rPr>
-        <w:t>Example test 1: describe-trails confirms multi-region and log file validation are enabled and the trail is logging (every 6 hours).; Example test 2: Config aggregator query confirms recorder status is recording in 100 percent of in-scope accounts (daily).</w:t>
+        <w:t>Example (reference architecture, replace with your real implementation): AWS Config managed rule multi-region-cloudtrail-enabled confirms an organization trail records management events in every region; pass requires COMPLIANT in every in-scope account. (automated, continuous (AWS Config evaluation), collected daily); Example (reference architecture, replace with your real implementation): AWS Config managed rule cloud-trail-log-file-validation-enabled confirms trail log-file integrity validation is on; pass requires COMPLIANT for every trail. (automated, continuous (AWS Config evaluation), collected daily)</w:t>
       </w:r>
     </w:p>
     <w:p>
@@ -7626,7 +7626,7 @@
         <w:rPr>
           <w:i w:val="0"/>
         </w:rPr>
-        <w:t>Example test 1: config rule iam-user-no-passwords-or-keys returns COMPLIANT for all accounts (daily).; Example test 2: CloudTrail Lake query for console login events without MFA returns zero rows (daily).</w:t>
+        <w:t>Example (reference architecture, replace with your real implementation): AWS Config managed rule mfa-enabled-for-iam-console-access confirms no console password exists without MFA; pass requires COMPLIANT in every in-scope account. (automated, continuous (AWS Config evaluation), collected daily); Example (reference architecture, replace with your real implementation): AWS Config managed rule root-account-mfa-enabled confirms the root user is MFA-protected; pass requires COMPLIANT in every in-scope account. (automated, continuous (AWS Config evaluation), collected daily)</w:t>
       </w:r>
     </w:p>
     <w:p>
@@ -8038,7 +8038,7 @@
         <w:rPr>
           <w:i w:val="0"/>
         </w:rPr>
-        <w:t>Example test 1: Config rules encrypted-volumes and rds-storage-encrypted are COMPLIANT for all resources (continuous).; Example test 2: EBS default encryption and S3 Block Public Access report enabled for every in-scope account (daily).</w:t>
+        <w:t>Example (reference architecture, replace with your real implementation): AWS Config managed rule encrypted-volumes confirms every attached EBS volume is encrypted; pass requires COMPLIANT for all resources. (automated, continuous (AWS Config evaluation), collected daily); Example (reference architecture, replace with your real implementation): AWS Config managed rule s3-bucket-server-side-encryption-enabled confirms default encryption on every bucket; pass requires COMPLIANT for all buckets. (automated, continuous (AWS Config evaluation), collected daily)</w:t>
       </w:r>
     </w:p>
     <w:p>

</xml_diff>

<commit_message>
feat(template): remove every reference-architecture example; the template ships FedRAMP-derived guidance and TBD only
48 illustrative values across AFC-CSO-INB, FRC-CSO-JSN, VDR-CSO-DET, KSI-CMT-LMC, KSI-IAM-APM and KSI-SVC-SIN (prose, extension fields, structured example tests and evidence) replaced by honest TBD placeholders. Every rule's fill_guidance (statement, how to comply, evidence expected) comes from the pinned CR26 dataset and stays. Artifacts for classes A, B and C regenerated.
</commit_message>
<xml_diff>
--- a/sdr/human-readable/sdr-class-a-authoring.docx
+++ b/sdr/human-readable/sdr-class-a-authoring.docx
@@ -331,7 +331,7 @@
         <w:rPr>
           <w:i w:val="0"/>
         </w:rPr>
-        <w:t>Example (reference architecture, replace with your real implementation): A dedicated FedRAMP security inbox is maintained as a monitored distribution list reaching the security on-call rotation, separate from customer support channels. The address is registered with FedRAMP and published in the certification data.</w:t>
+        <w:t>[[ FILL: replace with the provider's real implementation facts ]]</w:t>
       </w:r>
     </w:p>
     <w:p>
@@ -345,7 +345,7 @@
         <w:rPr>
           <w:i w:val="0"/>
         </w:rPr>
-        <w:t>Example (reference architecture, replace with your real implementation): A monthly synthetic test email is sent to the inbox; the on-call rotation must acknowledge within the documented response window. Delivery, spam-filter, and distribution-list membership checks run monthly and after any mail-system change.</w:t>
+        <w:t>[[ FILL: replace with the provider's real implementation facts ]]</w:t>
       </w:r>
     </w:p>
     <w:p>
@@ -359,7 +359,7 @@
         <w:rPr>
           <w:i w:val="0"/>
         </w:rPr>
-        <w:t>Example: Security Operations Manager</w:t>
+        <w:t>[[ FILL: replace with the provider's real implementation facts ]]</w:t>
       </w:r>
     </w:p>
     <w:p>
@@ -3382,7 +3382,7 @@
         <w:rPr>
           <w:i w:val="0"/>
         </w:rPr>
-        <w:t>Example (reference architecture, replace with your real implementation): All machine-readable certification information is produced as JSON validated against the corresponding published FedRAMP JSON schema before release. The generation pipeline pins the current official schema, hash-compares it against the live published schema at each run, and fails the build on any validation error.</w:t>
+        <w:t>[[ FILL: replace with the provider's real implementation facts ]]</w:t>
       </w:r>
     </w:p>
     <w:p>
@@ -3396,7 +3396,7 @@
         <w:rPr>
           <w:i w:val="0"/>
         </w:rPr>
-        <w:t>Example (reference architecture, replace with your real implementation): Schema validation runs in CI on every change to certification data; results are retained with the build record. A scheduled job re-validates published artifacts weekly against the live schema to catch in-place schema updates.</w:t>
+        <w:t>[[ FILL: replace with the provider's real implementation facts ]]</w:t>
       </w:r>
     </w:p>
     <w:p>
@@ -3410,7 +3410,7 @@
         <w:rPr>
           <w:i w:val="0"/>
         </w:rPr>
-        <w:t>Example: Compliance Engineering Lead</w:t>
+        <w:t>[[ FILL: replace with the provider's real implementation facts ]]</w:t>
       </w:r>
     </w:p>
     <w:p>
@@ -5179,7 +5179,7 @@
         <w:rPr>
           <w:i w:val="0"/>
         </w:rPr>
-        <w:t>Example (reference architecture, replace with your real implementation): Amazon Inspector continuously scans EC2 instances, ECR container images, and Lambda functions for software vulnerabilities across all in-scope accounts. Findings aggregate to Security Hub in the security tooling account. Coverage is verified against the asset inventory so every in-scope machine-based resource has an active scanning source.</w:t>
+        <w:t>[[ FILL: replace with the provider's real implementation facts ]]</w:t>
       </w:r>
     </w:p>
     <w:p>
@@ -5193,7 +5193,7 @@
         <w:rPr>
           <w:i w:val="0"/>
         </w:rPr>
-        <w:t>Example (reference architecture, replace with your real implementation): A daily job compares Inspector coverage status against the resource inventory from AWS Config; any in-scope resource without coverage opens a ticket. Finding ingestion freshness is checked daily so no source is silent for more than 24 hours.</w:t>
+        <w:t>[[ FILL: replace with the provider's real implementation facts ]]</w:t>
       </w:r>
     </w:p>
     <w:p>
@@ -5207,7 +5207,7 @@
         <w:rPr>
           <w:i w:val="0"/>
         </w:rPr>
-        <w:t>Example: Vulnerability Management Lead</w:t>
+        <w:t>[[ FILL: replace with the provider's real implementation facts ]]</w:t>
       </w:r>
     </w:p>
     <w:p>
@@ -6980,7 +6980,7 @@
         <w:rPr>
           <w:i w:val="0"/>
         </w:rPr>
-        <w:t>Example (reference architecture, replace with your real implementation): All modifications to the cloud service offering are made through version-controlled infrastructure as code deployed by the CI/CD pipeline. AWS CloudTrail organization trail records all management events in every account and region. AWS Config records configuration changes for all supported resource types. Manual changes are detected by comparing CloudTrail write events against pipeline deployment windows.</w:t>
+        <w:t>[[ FILL: replace with the provider's real implementation facts ]]</w:t>
       </w:r>
     </w:p>
     <w:p>
@@ -6994,7 +6994,7 @@
         <w:rPr>
           <w:i w:val="0"/>
         </w:rPr>
-        <w:t>Example (reference architecture, replace with your real implementation): A scheduled validation confirms the organization trail is logging, multi-region, and log-file validated, and that AWS Config recorders are running in every in-scope account and region. An EventBridge rule alerts on any out-of-pipeline write event by a non-pipeline principal.</w:t>
+        <w:t>[[ FILL: replace with the provider's real implementation facts ]]</w:t>
       </w:r>
     </w:p>
     <w:p>
@@ -7008,7 +7008,7 @@
         <w:rPr>
           <w:i w:val="0"/>
         </w:rPr>
-        <w:t>Example (reference architecture, replace with your real implementation): AWS Config managed rule multi-region-cloudtrail-enabled confirms an organization trail records management events in every region; pass requires COMPLIANT in every in-scope account. (automated, continuous (AWS Config evaluation), collected daily); Example (reference architecture, replace with your real implementation): AWS Config managed rule cloud-trail-log-file-validation-enabled confirms trail log-file integrity validation is on; pass requires COMPLIANT for every trail. (automated, continuous (AWS Config evaluation), collected daily)</w:t>
+        <w:t>[[ FILL: replace with the provider's real implementation facts ]]</w:t>
       </w:r>
     </w:p>
     <w:p>
@@ -7022,7 +7022,7 @@
         <w:rPr>
           <w:i w:val="0"/>
         </w:rPr>
-        <w:t>Example: Platform Engineering Lead</w:t>
+        <w:t>[[ FILL: replace with the provider's real implementation facts ]]</w:t>
       </w:r>
     </w:p>
     <w:p>
@@ -7598,7 +7598,7 @@
         <w:rPr>
           <w:i w:val="0"/>
         </w:rPr>
-        <w:t>Example (reference architecture, replace with your real implementation): Workforce access uses AWS IAM Identity Center federated to the corporate identity provider. Passwordless FIDO2 security keys are the primary authentication method; where passwordless is not feasible, strong passwords with phishing-resistant MFA (FIDO2/WebAuthn) are enforced by the identity provider conditional access policy. Console password login without MFA is blocked. Programmatic access uses short-lived STS credentials only; no long-lived IAM user access keys exist.</w:t>
+        <w:t>[[ FILL: replace with the provider's real implementation facts ]]</w:t>
       </w:r>
     </w:p>
     <w:p>
@@ -7612,7 +7612,7 @@
         <w:rPr>
           <w:i w:val="0"/>
         </w:rPr>
-        <w:t>Example (reference architecture, replace with your real implementation): A daily AWS Config custom rule checks that no IAM users have console passwords or active access keys. A daily Identity Center API check confirms MFA enforcement is active for every permission set. A CloudTrail Lake query detects any console login event without MFA; any hit creates a high-priority ticket within 15 minutes.</w:t>
+        <w:t>[[ FILL: replace with the provider's real implementation facts ]]</w:t>
       </w:r>
     </w:p>
     <w:p>
@@ -7626,7 +7626,7 @@
         <w:rPr>
           <w:i w:val="0"/>
         </w:rPr>
-        <w:t>Example (reference architecture, replace with your real implementation): AWS Config managed rule mfa-enabled-for-iam-console-access confirms no console password exists without MFA; pass requires COMPLIANT in every in-scope account. (automated, continuous (AWS Config evaluation), collected daily); Example (reference architecture, replace with your real implementation): AWS Config managed rule root-account-mfa-enabled confirms the root user is MFA-protected; pass requires COMPLIANT in every in-scope account. (automated, continuous (AWS Config evaluation), collected daily)</w:t>
+        <w:t>[[ FILL: replace with the provider's real implementation facts ]]</w:t>
       </w:r>
     </w:p>
     <w:p>
@@ -7640,7 +7640,7 @@
         <w:rPr>
           <w:i w:val="0"/>
         </w:rPr>
-        <w:t>Example: Identity and Access Lead</w:t>
+        <w:t>[[ FILL: replace with the provider's real implementation facts ]]</w:t>
       </w:r>
     </w:p>
     <w:p>
@@ -8010,7 +8010,7 @@
         <w:rPr>
           <w:i w:val="0"/>
         </w:rPr>
-        <w:t>Example (reference architecture, replace with your real implementation): All federal information is encrypted in transit with TLS 1.2 or higher using FIPS-validated endpoints where required, and at rest with AWS KMS customer managed keys. S3 buckets enforce bucket-level encryption and deny unencrypted uploads by bucket policy. EBS volumes and RDS storage use KMS CMKs by default via account-level settings. Public access is blocked account-wide for S3.</w:t>
+        <w:t>[[ FILL: replace with the provider's real implementation facts ]]</w:t>
       </w:r>
     </w:p>
     <w:p>
@@ -8024,7 +8024,7 @@
         <w:rPr>
           <w:i w:val="0"/>
         </w:rPr>
-        <w:t>Example (reference architecture, replace with your real implementation): AWS Config managed rules check encrypted-volumes, rds-storage-encrypted, and S3 default encryption continuously. A daily query confirms account-level EBS default encryption and S3 Block Public Access remain enabled in every account.</w:t>
+        <w:t>[[ FILL: replace with the provider's real implementation facts ]]</w:t>
       </w:r>
     </w:p>
     <w:p>
@@ -8038,7 +8038,7 @@
         <w:rPr>
           <w:i w:val="0"/>
         </w:rPr>
-        <w:t>Example (reference architecture, replace with your real implementation): AWS Config managed rule encrypted-volumes confirms every attached EBS volume is encrypted; pass requires COMPLIANT for all resources. (automated, continuous (AWS Config evaluation), collected daily); Example (reference architecture, replace with your real implementation): AWS Config managed rule s3-bucket-server-side-encryption-enabled confirms default encryption on every bucket; pass requires COMPLIANT for all buckets. (automated, continuous (AWS Config evaluation), collected daily)</w:t>
+        <w:t>[[ FILL: replace with the provider's real implementation facts ]]</w:t>
       </w:r>
     </w:p>
     <w:p>
@@ -8052,7 +8052,7 @@
         <w:rPr>
           <w:i w:val="0"/>
         </w:rPr>
-        <w:t>Example: Security Engineering Lead</w:t>
+        <w:t>[[ FILL: replace with the provider's real implementation facts ]]</w:t>
       </w:r>
     </w:p>
     <w:p>

</xml_diff>

<commit_message>
chore: adopt CR26 dataset 2026.10.05.01 (lock + full regenerate)
</commit_message>
<xml_diff>
--- a/sdr/human-readable/sdr-class-a-authoring.docx
+++ b/sdr/human-readable/sdr-class-a-authoring.docx
@@ -27,7 +27,7 @@
     </w:p>
     <w:p>
       <w:r>
-        <w:t>Generated from dataset 2026.09.13.02</w:t>
+        <w:t>Generated from dataset 2026.10.05.01</w:t>
       </w:r>
     </w:p>
     <w:p>
@@ -1375,6 +1375,20 @@
         <w:rPr>
           <w:b/>
         </w:rPr>
+        <w:t xml:space="preserve">Official note: </w:t>
+      </w:r>
+      <w:r>
+        <w:rPr>
+          <w:i/>
+        </w:rPr>
+        <w:t>The JSON data for this rule will be consumed by FedRAMP and agency GRC tools using automation with web-based tools. Do not expect FedRAMP or your customers to download this data directly, it should be accessible for common web frameworks. FedRAMP strongly recommends that application engineering experts be involved in making public JSON data and the related information available in a way that can work with web-based applications.</w:t>
+      </w:r>
+    </w:p>
+    <w:p>
+      <w:r>
+        <w:rPr>
+          <w:b/>
+        </w:rPr>
         <w:t xml:space="preserve">How to comply (SAS guidance): </w:t>
       </w:r>
       <w:r>
@@ -1830,6 +1844,20 @@
         <w:rPr>
           <w:b/>
         </w:rPr>
+        <w:t xml:space="preserve">Official note: </w:t>
+      </w:r>
+      <w:r>
+        <w:rPr>
+          <w:i/>
+        </w:rPr>
+        <w:t>Cryptographic modules include specific algorithms by definition; if an update stream of a cryptographic module adds new algorithms that were not previously validated then those algorithms can not be considered within the scope of update stream usage under these rules as they are new algorithms within the module that have never been validated.</w:t>
+      </w:r>
+    </w:p>
+    <w:p>
+      <w:r>
+        <w:rPr>
+          <w:b/>
+        </w:rPr>
         <w:t xml:space="preserve">How to comply (SAS guidance): </w:t>
       </w:r>
       <w:r>
@@ -3287,7 +3315,7 @@
         <w:rPr>
           <w:i w:val="0"/>
         </w:rPr>
-        <w:t>Providers MUST supply machine-readable information in JSON documents that are valid against the corresponding JSON schema when a rule contains a FedRAMP JSON schema, UNLESS otherwise specified in the rule.</w:t>
+        <w:t>Providers MUST supply machine-readable information in JSON documents that are valid against the corresponding JSON schema when a rule contains a FedRAMP JSON schema, UNLESS otherwise specified in the rule; public JSON data MUST be supplied in a manner compatible with modern web frameworks, including:</w:t>
       </w:r>
     </w:p>
     <w:p>
@@ -3302,6 +3330,34 @@
           <w:i/>
         </w:rPr>
         <w:t>FedRAMP JSON schemas are designed to be lightweight and flexible to establish a minimum set of structured information while allowing providers to improve on the format and structure of the information as needed to meet their needs and the needs of their customers.</w:t>
+      </w:r>
+    </w:p>
+    <w:p>
+      <w:r>
+        <w:rPr>
+          <w:b/>
+        </w:rPr>
+        <w:t xml:space="preserve">Official note: </w:t>
+      </w:r>
+      <w:r>
+        <w:rPr>
+          <w:i/>
+        </w:rPr>
+        <w:t>Public JSON data is intended to be consumed by FedRAMP, agency GRC tools, and more - it should be available in a way that enables standard web-application use following standard web frameworks. Generally, if you can't write a web app to parse this data without configuring a browser to bypass security defaults then there has likely been a problem.</w:t>
+      </w:r>
+    </w:p>
+    <w:p>
+      <w:r>
+        <w:rPr>
+          <w:b/>
+        </w:rPr>
+        <w:t xml:space="preserve">Official note: </w:t>
+      </w:r>
+      <w:r>
+        <w:rPr>
+          <w:i/>
+        </w:rPr>
+        <w:t>The Schema Validator available at fedramp.gov will not work properly if Cross-Origin Resource Sharing is not properly configured.</w:t>
       </w:r>
     </w:p>
     <w:p>

</xml_diff>

<commit_message>
chore: adopt CR26 dataset 2026.10.08.01 (lock + full regenerate)
</commit_message>
<xml_diff>
--- a/sdr/human-readable/sdr-class-a-authoring.docx
+++ b/sdr/human-readable/sdr-class-a-authoring.docx
@@ -27,7 +27,7 @@
     </w:p>
     <w:p>
       <w:r>
-        <w:t>Generated from dataset 2026.10.05.01</w:t>
+        <w:t>Generated from dataset 2026.10.08.01</w:t>
       </w:r>
     </w:p>
     <w:p>
@@ -4972,6 +4972,20 @@
           <w:i w:val="0"/>
         </w:rPr>
         <w:t>Providers with 20x Class A Certifications MAY also include historical metrics in their Security Decision Record.</w:t>
+      </w:r>
+    </w:p>
+    <w:p>
+      <w:r>
+        <w:rPr>
+          <w:b/>
+        </w:rPr>
+        <w:t xml:space="preserve">Official note: </w:t>
+      </w:r>
+      <w:r>
+        <w:rPr>
+          <w:i/>
+        </w:rPr>
+        <w:t>For initial FedRAMP Certification, providers will need to have mechanisms in place and agree to meet this requirement in the event the cloud service has not been operating with related metrics available for the required period prior to applying for initial certification.</w:t>
       </w:r>
     </w:p>
     <w:p>

</xml_diff>

<commit_message>
chore: adopt CR26 dataset 2026.10.13.01 (lock + full regenerate)
</commit_message>
<xml_diff>
--- a/sdr/human-readable/sdr-class-a-authoring.docx
+++ b/sdr/human-readable/sdr-class-a-authoring.docx
@@ -27,7 +27,7 @@
     </w:p>
     <w:p>
       <w:r>
-        <w:t>Generated from dataset 2026.10.08.01</w:t>
+        <w:t>Generated from dataset 2026.10.13.01</w:t>
       </w:r>
     </w:p>
     <w:p>
@@ -6749,7 +6749,7 @@
         <w:rPr>
           <w:i w:val="0"/>
         </w:rPr>
-        <w:t>cp-3, ir-2, ps-6, at-2, at-2.2, at-2.3, at-3.5, at-4, ir-2.3, at-3, sr-11.1</w:t>
+        <w:t>at-2, at-2.2, at-2.3, at-3, at-3.5, at-4, cm-11, cp-3, cp-3.1, ir-2, ir-2.1, ir-2.2, ir-2.3, ir-9.2, ir-9.4, pl-4, pl-4.1, ps-6, sr-11.1</w:t>
       </w:r>
     </w:p>
     <w:p>
@@ -6955,7 +6955,7 @@
         <w:rPr>
           <w:i w:val="0"/>
         </w:rPr>
-        <w:t>au-2, cm-3, cm-3.2, cm-4.2, cm-6, cm-8.3, ma-2</w:t>
+        <w:t>au-2, ca-7.4, cm-3, cm-3.1, cm-3.2, cm-3.6, cm-4.2, cm-6, cm-8.3</w:t>
       </w:r>
     </w:p>
     <w:p>
@@ -7161,7 +7161,7 @@
         <w:rPr>
           <w:i w:val="0"/>
         </w:rPr>
-        <w:t>ac-17.3, ca-9, cm-7.1, sc-7.5, si-8</w:t>
+        <w:t>ac-17.3, ca-9, cm-7.1, sc-7.10, sc-7.18, sc-7.20, sc-7.21, sc-7.5, si-10, si-4.11, si-4.18, si-4.4, si-8</w:t>
       </w:r>
     </w:p>
     <w:p>
@@ -7367,7 +7367,7 @@
         <w:rPr>
           <w:i w:val="0"/>
         </w:rPr>
-        <w:t>ac-2.2, ac-2.3, ac-2.13, ac-6.7, ia-4.4, ia-12, ia-12.2, ia-12.3, ia-12.5</w:t>
+        <w:t>ac-2.13, ac-2.2, ac-2.3, ac-6.7, ia-12, ia-12.2, ia-12.3, ia-12.5, ia-4.4, ia-8.4</w:t>
       </w:r>
     </w:p>
     <w:p>
@@ -7573,7 +7573,7 @@
         <w:rPr>
           <w:i w:val="0"/>
         </w:rPr>
-        <w:t>ac-3, ia-5.1, ia-5.2, ia-5.6, ia-6, ac-2, ia-2, ia-2.1, ia-2.2, ia-2.8, ia-5, ia-8, sc-23</w:t>
+        <w:t>ac-2, ac-3, ia-2, ia-2.1, ia-2.2, ia-2.6, ia-2.8, ia-5, ia-5.1, ia-5.2, ia-5.6, ia-5.8, ia-6, ia-8, ia-8.2, ia-8.4, sc-23</w:t>
       </w:r>
     </w:p>
     <w:p>
@@ -7779,7 +7779,7 @@
         <w:rPr>
           <w:i w:val="0"/>
         </w:rPr>
-        <w:t>ir-4, ir-4.1, ir-6, ir-6.1, ir-6.3, ir-7, ir-7.1, ir-8, ir-8.1, si-4.5</w:t>
+        <w:t>ir-4, ir-4.1, ir-4.11, ir-6, ir-6.1, ir-6.3, ir-7, ir-7.1, ir-8, ir-8.1, ir-9.3, si-4.5</w:t>
       </w:r>
     </w:p>
     <w:p>
@@ -7985,7 +7985,7 @@
         <w:rPr>
           <w:i w:val="0"/>
         </w:rPr>
-        <w:t>ac-1, ac-17.2, cp-9.8, sc-8, sc-8.1, sc-13, sc-20, sc-21, sc-22, sc-23, sc-28, sc-28.1</w:t>
+        <w:t>ac-11, ac-11.1, ac-17.2, ac-19.5, ac-21, cp-9.8, ir-9.4, sc-13, sc-20, sc-21, sc-22, sc-23, sc-28, sc-28.1, sc-4, sc-7.18, sc-8, sc-8.1, si-4.18</w:t>
       </w:r>
     </w:p>
     <w:p>

</xml_diff>